<commit_message>
Expert audit fixes for Blog 4: fix fabricated citation, misattributed source, AI hooks
- Remove fabricated JAIT "78% vs 52%" claim in FAQ 6 (study was about AI detection tools, not human expert accuracy)
- Fix Google citation: Dec 2022 E-E-A-T page → Feb 2023 AI content guidance (correct source)
- Fix Grammarly attribution: separate independent "50-269x" data from Grammarly's own findings
- Remove unverified "500-800 words" claim in FAQ 1
- Replace 3 AI transition hooks ("Here's what/how", "But here's")
- Reduce "60-90 minutes" repetition (5→3 instances)
- Rebuild Word doc with all fixes and clickable hyperlinks

Co-Authored-By: Claude Opus 4.6 <noreply@anthropic.com>
Claude-Session: https://claude.ai/code/session_012jX8bmSNRmEaK3kdhxwfZr
</commit_message>
<xml_diff>
--- a/blog-content/How-to-Humanize-AI-Content.docx
+++ b/blog-content/How-to-Humanize-AI-Content.docx
@@ -88,7 +88,7 @@
         </w:rPr>
         <w:t xml:space="preserve">After editing over 60 AI-drafted articles for </w:t>
       </w:r>
-      <w:hyperlink w:history="1" r:id="rIdygd64et7zm8ivlmnizjtt">
+      <w:hyperlink w:history="1" r:id="rIdao3jd3xik6c2axhz3dtz-">
         <w:r>
           <w:rPr>
             <w:rStyle w:val="Hyperlink"/>
@@ -185,7 +185,7 @@
         </w:rPr>
         <w:t xml:space="preserve">A </w:t>
       </w:r>
-      <w:hyperlink w:history="1" r:id="rId_qglrfozrk_ipoxiayeir">
+      <w:hyperlink w:history="1" r:id="rId3hm0zit0hp-gxvca8sc1s">
         <w:r>
           <w:rPr>
             <w:rStyle w:val="Hyperlink"/>
@@ -195,7 +195,7 @@
             <w:szCs w:val="24"/>
             <w:u w:val="single"/>
           </w:rPr>
-          <w:t xml:space="preserve">Grammarly analysis of AI writing patterns</w:t>
+          <w:t xml:space="preserve">Grammarly breakdown of common AI words</w:t>
         </w:r>
       </w:hyperlink>
       <w:r>
@@ -205,7 +205,7 @@
           <w:sz w:val="24"/>
           <w:szCs w:val="24"/>
         </w:rPr>
-        <w:t xml:space="preserve"> found that AI tools consistently overuse specific words — "delve," "moreover," "crucial," "tapestry," "landscape," and "furthermore" — at rates far above normal human writing. These words aren’t wrong. They’re just signals that no human sat down and chose them.</w:t>
+        <w:t xml:space="preserve"> highlights how AI writing leans on analytical, academic vocabulary — phrases like "shed light on," "facilitate," and predictable transitions. Independent analyses have found words like "delve," "moreover," "tapestry," and "landscape" appearing at 50 to 269 times the rate of normal human writing. These words aren't wrong. They're just signals that no human sat down and chose them.</w:t>
       </w:r>
     </w:p>
     <w:p>
@@ -325,7 +325,7 @@
           <w:sz w:val="24"/>
           <w:szCs w:val="24"/>
         </w:rPr>
-        <w:t xml:space="preserve">Humanizing for detectors means tricking a tool like GPTZero or Originality.ai into scoring your AI text as "human." Spinner tools do this by swapping synonyms, rearranging sentence structure, and inserting random variation. The text passes the detector but reads worse than the original AI output. You’ve solved a measurement problem while making the real product — reader experience — actively worse.</w:t>
+        <w:t xml:space="preserve">Humanizing for detectors means tricking a tool like GPTZero or Originality.ai into scoring your AI text as "human." Spinner tools do this by swapping synonyms, rearranging sentence structure, and inserting random variation. The text passes the detector but reads worse than the original AI output. You've solved a measurement problem while making the real product — reader experience — actively worse.</w:t>
       </w:r>
     </w:p>
     <w:p>
@@ -353,7 +353,7 @@
           <w:sz w:val="24"/>
           <w:szCs w:val="24"/>
         </w:rPr>
-        <w:t xml:space="preserve">Every recommendation in this guide targets the reader-first approach. If your main concern is "bypassing AI detectors," you’re optimising for the wrong metric.</w:t>
+        <w:t xml:space="preserve">Every recommendation in this guide targets the reader-first approach. If your main concern is "bypassing AI detectors," you're optimising for the wrong metric.</w:t>
       </w:r>
     </w:p>
     <w:p>
@@ -386,7 +386,7 @@
         </w:rPr>
         <w:t xml:space="preserve">Here is the exact 8-step editing workflow I use for every AI-drafted article on this site. The whole process takes 60 to 90 minutes per piece — a fraction of the </w:t>
       </w:r>
-      <w:hyperlink w:history="1" r:id="rIdbdfhsk3o7adj1xb3p08gi">
+      <w:hyperlink w:history="1" r:id="rIdgxuhne_nc5qgca0etnk-0">
         <w:r>
           <w:rPr>
             <w:rStyle w:val="Hyperlink"/>
@@ -406,7 +406,7 @@
           <w:sz w:val="24"/>
           <w:szCs w:val="24"/>
         </w:rPr>
-        <w:t xml:space="preserve"> the average blog post takes from scratch, according to Orbit Media’s 2025 survey.</w:t>
+        <w:t xml:space="preserve"> the average blog post takes from scratch, according to Orbit Media's 2025 survey.</w:t>
       </w:r>
     </w:p>
     <w:p>
@@ -437,7 +437,7 @@
           <w:sz w:val="24"/>
           <w:szCs w:val="24"/>
         </w:rPr>
-        <w:t xml:space="preserve">The fastest way to reduce editing time is to front-load the thinking. Before you generate a single word, build a brief that includes your target keyword, your specific angle, your audience’s pain point, the tone you want, and any personal data or experience you plan to include.</w:t>
+        <w:t xml:space="preserve">The fastest way to reduce editing time is to front-load the thinking. Before you generate a single word, build a brief that includes your target keyword, your specific angle, your audience's pain point, the tone you want, and any personal data or experience you plan to include.</w:t>
       </w:r>
     </w:p>
     <w:p>
@@ -453,7 +453,7 @@
         </w:rPr>
         <w:t xml:space="preserve">A prompt like "write a blog post about email marketing" produces generic fluff. A prompt like "write a 2,000-word guide on re-engagement email sequences for SaaS companies with 30-day trial models, written in first person, referencing a churn rate we reduced from 8.2% to 5.1%" produces something worth editing. I break down this process fully in my </w:t>
       </w:r>
-      <w:hyperlink w:history="1" r:id="rIdwx-rf5do79_kf4l9iodcx">
+      <w:hyperlink w:history="1" r:id="rIddtd4_5jcoengkflcqmh4v">
         <w:r>
           <w:rPr>
             <w:rStyle w:val="Hyperlink"/>
@@ -579,7 +579,7 @@
           <w:sz w:val="24"/>
           <w:szCs w:val="24"/>
         </w:rPr>
-        <w:t xml:space="preserve">delve, tapestry, landscape (used metaphorically), utilize (use "use"), it’s important to note, in today’s digital age, at its core</w:t>
+        <w:t xml:space="preserve">delve, tapestry, landscape (used metaphorically), utilize (use "use"), it's important to note, in today's digital age, at its core</w:t>
       </w:r>
     </w:p>
     <w:p>
@@ -684,7 +684,7 @@
           <w:sz w:val="24"/>
           <w:szCs w:val="24"/>
         </w:rPr>
-        <w:t xml:space="preserve">If you don’t have personal data, use specific published case studies with proper citations. Generic examples are the biggest tell that nobody with real experience touched the content.</w:t>
+        <w:t xml:space="preserve">If you don't have personal data, use specific published case studies with proper citations. Generic examples are the biggest tell that nobody with real experience touched the content.</w:t>
       </w:r>
     </w:p>
     <w:p>
@@ -774,7 +774,7 @@
           <w:sz w:val="24"/>
           <w:szCs w:val="24"/>
         </w:rPr>
-        <w:t xml:space="preserve">AI won’t take a position. It hedges everything. "Some experts suggest... while others believe..." That’s useful for a Wikipedia article. It’s death for a blog post.</w:t>
+        <w:t xml:space="preserve">AI won't take a position. It hedges everything. "Some experts suggest... while others believe..." That's useful for a Wikipedia article. It's death for a blog post.</w:t>
       </w:r>
     </w:p>
     <w:p>
@@ -819,23 +819,23 @@
           <w:sz w:val="24"/>
           <w:szCs w:val="24"/>
         </w:rPr>
-        <w:t xml:space="preserve">AI hallucinates. It invents statistics, misattributes research, and cites studies that don’t exist. Every number, every claim, every "according to" in your draft needs verification against the original source.</w:t>
-      </w:r>
-    </w:p>
-    <w:p>
-      <w:pPr>
-        <w:spacing w:after="200" w:line="276"/>
-      </w:pPr>
-      <w:r>
-        <w:rPr>
-          <w:rFonts w:ascii="Calibri" w:cs="Calibri" w:eastAsia="Calibri" w:hAnsi="Calibri"/>
-          <w:color w:val="333333"/>
-          <w:sz w:val="24"/>
-          <w:szCs w:val="24"/>
-        </w:rPr>
-        <w:t xml:space="preserve">I’ve caught AI fabricating entire studies — complete with plausible-sounding journal names and publication years. If you can’t find the original source within two minutes of searching, delete the claim. A wrong citation damages your credibility more than a missing one. This is where I’ve seen the most damage in </w:t>
-      </w:r>
-      <w:hyperlink w:history="1" r:id="rIdk6wgmbsyirfvjcv2ak8lx">
+        <w:t xml:space="preserve">AI hallucinates. It invents statistics, misattributes research, and cites studies that don't exist. Every number, every claim, every "according to" in your draft needs verification against the original source.</w:t>
+      </w:r>
+    </w:p>
+    <w:p>
+      <w:pPr>
+        <w:spacing w:after="200" w:line="276"/>
+      </w:pPr>
+      <w:r>
+        <w:rPr>
+          <w:rFonts w:ascii="Calibri" w:cs="Calibri" w:eastAsia="Calibri" w:hAnsi="Calibri"/>
+          <w:color w:val="333333"/>
+          <w:sz w:val="24"/>
+          <w:szCs w:val="24"/>
+        </w:rPr>
+        <w:t xml:space="preserve">I've caught AI fabricating entire studies — complete with plausible-sounding journal names and publication years. If you can't find the original source within two minutes of searching, delete the claim. A wrong citation damages your credibility more than a missing one. This is where I've seen the most damage in </w:t>
+      </w:r>
+      <w:hyperlink w:history="1" r:id="rIdedj_2ptlixe2nvcyqvwui">
         <w:r>
           <w:rPr>
             <w:rStyle w:val="Hyperlink"/>
@@ -886,7 +886,7 @@
           <w:sz w:val="24"/>
           <w:szCs w:val="24"/>
         </w:rPr>
-        <w:t xml:space="preserve">Wait at least an hour. Then read the piece as if you’ve never seen it before. Ask yourself: does this sound like a person with experience wrote it, or does it sound like a well-formatted summary of other people’s content?</w:t>
+        <w:t xml:space="preserve">Wait at least an hour. Then read the piece as if you've never seen it before. Ask yourself: does this sound like a person with experience wrote it, or does it sound like a well-formatted summary of other people's content?</w:t>
       </w:r>
     </w:p>
     <w:p>
@@ -947,7 +947,7 @@
           <w:sz w:val="24"/>
           <w:szCs w:val="24"/>
         </w:rPr>
-        <w:t xml:space="preserve">Theory is useless without examples. Here’s what the editing process looks like in practice.</w:t>
+        <w:t xml:space="preserve">Theory is useless without examples. The editing process looks like this in practice.</w:t>
       </w:r>
     </w:p>
     <w:p>
@@ -980,7 +980,7 @@
           <w:sz w:val="24"/>
           <w:szCs w:val="24"/>
         </w:rPr>
-        <w:t xml:space="preserve">"Email marketing remains a crucial tool in the digital marketer’s landscape. It is important to note that personalization can significantly boost engagement rates. Many experts suggest that segmented campaigns deliver better results than generic blasts. By leveraging automation tools, businesses can streamline their email workflows and foster deeper customer relationships."</w:t>
+        <w:t xml:space="preserve">"Email marketing remains a crucial tool in the digital marketer's landscape. It is important to note that personalization can significantly boost engagement rates. Many experts suggest that segmented campaigns deliver better results than generic blasts. By leveraging automation tools, businesses can streamline their email workflows and foster deeper customer relationships."</w:t>
       </w:r>
     </w:p>
     <w:p>
@@ -1058,9 +1058,9 @@
           <w:sz w:val="24"/>
           <w:szCs w:val="24"/>
         </w:rPr>
-        <w:t xml:space="preserve">Google’s </w:t>
-      </w:r>
-      <w:hyperlink w:history="1" r:id="rIdjowrzjfoo-rqjytjpqnh_">
+        <w:t xml:space="preserve">Google's </w:t>
+      </w:r>
+      <w:hyperlink w:history="1" r:id="rIdw1_no_ccykn6lwfa63hyf">
         <w:r>
           <w:rPr>
             <w:rStyle w:val="Hyperlink"/>
@@ -1070,7 +1070,7 @@
             <w:szCs w:val="24"/>
             <w:u w:val="single"/>
           </w:rPr>
-          <w:t xml:space="preserve">Quality Rater Guidelines</w:t>
+          <w:t xml:space="preserve">official guidance on AI content</w:t>
         </w:r>
       </w:hyperlink>
       <w:r>
@@ -1080,7 +1080,7 @@
           <w:sz w:val="24"/>
           <w:szCs w:val="24"/>
         </w:rPr>
-        <w:t xml:space="preserve"> explicitly state that AI use alone doesn’t determine content quality. What matters is whether the content demonstrates Experience, Expertise, Authoritativeness, and Trustworthiness — and raw AI content fails on at least three of those four.</w:t>
+        <w:t xml:space="preserve"> states that their ranking systems reward content demonstrating E-E-A-T qualities regardless of how it was produced. What matters is whether the content demonstrates Experience, Expertise, Authoritativeness, and Trustworthiness — and raw AI content fails on at least three of those four.</w:t>
       </w:r>
     </w:p>
     <w:p>
@@ -1111,7 +1111,7 @@
           <w:sz w:val="24"/>
           <w:szCs w:val="24"/>
         </w:rPr>
-        <w:t xml:space="preserve">This is your biggest competitive advantage over anyone publishing unedited AI content. Experience means you’ve actually done the thing you’re writing about. Screenshots of your analytics dashboard, specific results from your campaigns, lessons from your failures — AI can’t generate these because they haven’t happened to it.</w:t>
+        <w:t xml:space="preserve">This is your biggest competitive advantage over anyone publishing unedited AI content. Experience means you've actually done the thing you're writing about. Screenshots of your analytics dashboard, specific results from your campaigns, lessons from your failures — AI can't generate these because they haven't happened to it.</w:t>
       </w:r>
     </w:p>
     <w:p>
@@ -1142,7 +1142,7 @@
           <w:sz w:val="28"/>
           <w:szCs w:val="28"/>
         </w:rPr>
-        <w:t xml:space="preserve">Expertise — show the depth AI can’t reach</w:t>
+        <w:t xml:space="preserve">Expertise — show the depth AI can't reach</w:t>
       </w:r>
     </w:p>
     <w:p>
@@ -1218,7 +1218,7 @@
           <w:sz w:val="24"/>
           <w:szCs w:val="24"/>
         </w:rPr>
-        <w:t xml:space="preserve">Clear author bylines, accurate information, corrections when you get something wrong, and honest recommendations. If you use AI tools in your workflow, there’s nothing wrong with saying so. Transparency builds trust. Pretending everything is handwritten when it isn’t — that erodes it.</w:t>
+        <w:t xml:space="preserve">Clear author bylines, accurate information, corrections when you get something wrong, and honest recommendations. If you use AI tools in your workflow, there's nothing wrong with saying so. Transparency builds trust. Pretending everything is handwritten when it isn't — that erodes it.</w:t>
       </w:r>
     </w:p>
     <w:p>
@@ -1265,7 +1265,7 @@
         </w:rPr>
         <w:t xml:space="preserve">A </w:t>
       </w:r>
-      <w:hyperlink w:history="1" r:id="rIdyagc2zz16sxc-lzfsl2aw">
+      <w:hyperlink w:history="1" r:id="rIddbsfvg09iepg-4xsgfpzq">
         <w:r>
           <w:rPr>
             <w:rStyle w:val="Hyperlink"/>
@@ -1285,35 +1285,35 @@
           <w:sz w:val="24"/>
           <w:szCs w:val="24"/>
         </w:rPr>
-        <w:t xml:space="preserve"> (November 2025) found that human-written content holds the number-one ranking position 80% of the time, compared to just 9% for purely AI-generated pages. That’s an 8-to-1 ratio at the position that captures the most clicks.</w:t>
-      </w:r>
-    </w:p>
-    <w:p>
-      <w:pPr>
-        <w:spacing w:after="200" w:line="276"/>
-      </w:pPr>
-      <w:r>
-        <w:rPr>
-          <w:rFonts w:ascii="Calibri" w:cs="Calibri" w:eastAsia="Calibri" w:hAnsi="Calibri"/>
-          <w:color w:val="333333"/>
-          <w:sz w:val="24"/>
-          <w:szCs w:val="24"/>
-        </w:rPr>
-        <w:t xml:space="preserve">But here’s the part most people miss: a separate Semrush analysis of 20,000 URLs found that 57% of AI content and 58% of human content appear somewhere in the top 10. Getting on page one isn’t the hard part. Getting to positions one through three — where the real traffic lives — is where human editing makes the difference.</w:t>
-      </w:r>
-    </w:p>
-    <w:p>
-      <w:pPr>
-        <w:spacing w:after="200" w:line="276"/>
-      </w:pPr>
-      <w:r>
-        <w:rPr>
-          <w:rFonts w:ascii="Calibri" w:cs="Calibri" w:eastAsia="Calibri" w:hAnsi="Calibri"/>
-          <w:color w:val="333333"/>
-          <w:sz w:val="24"/>
-          <w:szCs w:val="24"/>
-        </w:rPr>
-        <w:t xml:space="preserve">The clearest proof comes from Digital Harvest’s 2025 results: they published 200+ AI-assisted posts, each reviewed and edited by journalists before going live. The result was 144% total traffic growth and 159% organic search growth year over year. SE Ranking reported similar results — their edited AI articles earned 555,000+ impressions and 2,300+ clicks with several top-10 rankings.</w:t>
+        <w:t xml:space="preserve"> (November 2025) found that human-written content holds the number-one ranking position 80% of the time, compared to just 9% for purely AI-generated pages. That's an 8-to-1 ratio at the position that captures the most clicks.</w:t>
+      </w:r>
+    </w:p>
+    <w:p>
+      <w:pPr>
+        <w:spacing w:after="200" w:line="276"/>
+      </w:pPr>
+      <w:r>
+        <w:rPr>
+          <w:rFonts w:ascii="Calibri" w:cs="Calibri" w:eastAsia="Calibri" w:hAnsi="Calibri"/>
+          <w:color w:val="333333"/>
+          <w:sz w:val="24"/>
+          <w:szCs w:val="24"/>
+        </w:rPr>
+        <w:t xml:space="preserve">The part most people miss: a separate Semrush analysis of 20,000 URLs found that 57% of AI content and 58% of human content appear somewhere in the top 10. Getting on page one isn't the hard part. Getting to positions one through three — where the real traffic lives — is where human editing makes the difference.</w:t>
+      </w:r>
+    </w:p>
+    <w:p>
+      <w:pPr>
+        <w:spacing w:after="200" w:line="276"/>
+      </w:pPr>
+      <w:r>
+        <w:rPr>
+          <w:rFonts w:ascii="Calibri" w:cs="Calibri" w:eastAsia="Calibri" w:hAnsi="Calibri"/>
+          <w:color w:val="333333"/>
+          <w:sz w:val="24"/>
+          <w:szCs w:val="24"/>
+        </w:rPr>
+        <w:t xml:space="preserve">The clearest proof comes from Digital Harvest's 2025 results: they published 200+ AI-assisted posts, each reviewed and edited by journalists before going live. The result was 144% total traffic growth and 159% organic search growth year over year. SE Ranking reported similar results — their edited AI articles earned 555,000+ impressions and 2,300+ clicks with several top-10 rankings.</w:t>
       </w:r>
     </w:p>
     <w:p>
@@ -1374,21 +1374,21 @@
           <w:sz w:val="24"/>
           <w:szCs w:val="24"/>
         </w:rPr>
-        <w:t xml:space="preserve">Budget 60 to 90 minutes per article for the full editing workflow — not a quick skim and publish.</w:t>
-      </w:r>
-    </w:p>
-    <w:p>
-      <w:pPr>
-        <w:spacing w:after="200" w:line="276"/>
-      </w:pPr>
-      <w:r>
-        <w:rPr>
-          <w:rFonts w:ascii="Calibri" w:cs="Calibri" w:eastAsia="Calibri" w:hAnsi="Calibri"/>
-          <w:color w:val="333333"/>
-          <w:sz w:val="24"/>
-          <w:szCs w:val="24"/>
-        </w:rPr>
-        <w:t xml:space="preserve">Here’s how that breaks down against the alternatives:</w:t>
+        <w:t xml:space="preserve">Budget about an hour to an hour and a half per article for the full editing workflow — not a quick skim and publish.</w:t>
+      </w:r>
+    </w:p>
+    <w:p>
+      <w:pPr>
+        <w:spacing w:after="200" w:line="276"/>
+      </w:pPr>
+      <w:r>
+        <w:rPr>
+          <w:rFonts w:ascii="Calibri" w:cs="Calibri" w:eastAsia="Calibri" w:hAnsi="Calibri"/>
+          <w:color w:val="333333"/>
+          <w:sz w:val="24"/>
+          <w:szCs w:val="24"/>
+        </w:rPr>
+        <w:t xml:space="preserve">Compare that against the alternatives:</w:t>
       </w:r>
     </w:p>
     <w:tbl>
@@ -1848,7 +1848,7 @@
         </w:rPr>
         <w:t xml:space="preserve">The humanised AI approach gives you roughly 80% of pure-human quality at 20% of the cost and 30% of the time. That trade-off is why hybrid content strategies dominate the </w:t>
       </w:r>
-      <w:hyperlink w:history="1" r:id="rIdhypi6gn-nqih3hfplhthb">
+      <w:hyperlink w:history="1" r:id="rIdzdgv8mcxjsfkaspveek10">
         <w:r>
           <w:rPr>
             <w:rStyle w:val="Hyperlink"/>
@@ -1882,7 +1882,7 @@
           <w:sz w:val="24"/>
           <w:szCs w:val="24"/>
         </w:rPr>
-        <w:t xml:space="preserve">Where should you spend most of that 60-90 minutes? About 40% on Step 4 (replacing generic examples with specific ones) and Step 6 (adding your perspective). These two steps create the most separation between your content and the hundreds of other AI-assisted articles targeting the same keyword.</w:t>
+        <w:t xml:space="preserve">Where should you spend most of that editing time? About 40% on Step 4 (replacing generic examples with specific ones) and Step 6 (adding your perspective). These two steps create the most separation between your content and the hundreds of other AI-assisted articles targeting the same keyword.</w:t>
       </w:r>
     </w:p>
     <w:p>
@@ -2031,21 +2031,21 @@
           <w:sz w:val="24"/>
           <w:szCs w:val="24"/>
         </w:rPr>
-        <w:t xml:space="preserve"> — use a different prompt to challenge what the first draft produced. Ask it "what’s missing from this article?" or "what would a sceptic say about this section?" Then add those perspectives in your own words.</w:t>
-      </w:r>
-    </w:p>
-    <w:p>
-      <w:pPr>
-        <w:spacing w:after="200" w:line="276"/>
-      </w:pPr>
-      <w:r>
-        <w:rPr>
-          <w:rFonts w:ascii="Calibri" w:cs="Calibri" w:eastAsia="Calibri" w:hAnsi="Calibri"/>
-          <w:color w:val="333333"/>
-          <w:sz w:val="24"/>
-          <w:szCs w:val="24"/>
-        </w:rPr>
-        <w:t xml:space="preserve">The best humanizer is 60 to 90 minutes of your own editing time. No tool replaces the value of someone who has done the thing the article talks about sitting down and making the content real.</w:t>
+        <w:t xml:space="preserve"> — use a different prompt to challenge what the first draft produced. Ask it "what's missing from this article?" or "what would a sceptic say about this section?" Then add those perspectives in your own words.</w:t>
+      </w:r>
+    </w:p>
+    <w:p>
+      <w:pPr>
+        <w:spacing w:after="200" w:line="276"/>
+      </w:pPr>
+      <w:r>
+        <w:rPr>
+          <w:rFonts w:ascii="Calibri" w:cs="Calibri" w:eastAsia="Calibri" w:hAnsi="Calibri"/>
+          <w:color w:val="333333"/>
+          <w:sz w:val="24"/>
+          <w:szCs w:val="24"/>
+        </w:rPr>
+        <w:t xml:space="preserve">The best humanizer is your own editing time — roughly an hour per piece. No tool replaces the value of someone who has done the thing the article talks about sitting down and making the content real.</w:t>
       </w:r>
     </w:p>
     <w:p>
@@ -2076,7 +2076,7 @@
           <w:sz w:val="24"/>
           <w:szCs w:val="24"/>
         </w:rPr>
-        <w:t xml:space="preserve">Google’s position is clear and hasn’t changed in its core principle: they evaluate content quality, not content origin.</w:t>
+        <w:t xml:space="preserve">Google's position is clear and hasn't changed in its core principle: they evaluate content quality, not content origin.</w:t>
       </w:r>
     </w:p>
     <w:p>
@@ -2092,7 +2092,7 @@
         </w:rPr>
         <w:t xml:space="preserve">The </w:t>
       </w:r>
-      <w:hyperlink w:history="1" r:id="rIdjont7vbwhea067lbldz9c">
+      <w:hyperlink w:history="1" r:id="rIdd_cueoobx7qxklh3lf1tw">
         <w:r>
           <w:rPr>
             <w:rStyle w:val="Hyperlink"/>
@@ -2112,7 +2112,7 @@
           <w:sz w:val="24"/>
           <w:szCs w:val="24"/>
         </w:rPr>
-        <w:t xml:space="preserve"> documentation states that their systems reward content demonstrating E-E-A-T qualities regardless of how it was produced. AI content isn’t penalised for being AI content. It gets penalised for being low-quality content — which unedited AI output usually is.</w:t>
+        <w:t xml:space="preserve"> documentation states that their systems reward content demonstrating E-E-A-T qualities regardless of how it was produced. AI content isn't penalised for being AI content. It gets penalised for being low-quality content — which unedited AI output usually is.</w:t>
       </w:r>
     </w:p>
     <w:p>
@@ -2140,7 +2140,7 @@
           <w:sz w:val="24"/>
           <w:szCs w:val="24"/>
         </w:rPr>
-        <w:t xml:space="preserve">The practical takeaway: if you use AI as a drafting tool and add genuine human expertise through editing, Google treats your content the same as any other content. The moment you skip the editing and publish AI output at scale, you’re playing a short-term game that Google has explicitly said they’re watching for.</w:t>
+        <w:t xml:space="preserve">The practical takeaway: if you use AI as a drafting tool and add genuine human expertise through editing, Google treats your content the same as any other content. The moment you skip the editing and publish AI output at scale, you're playing a short-term game that Google has explicitly said they're watching for.</w:t>
       </w:r>
     </w:p>
     <w:p>
@@ -2188,7 +2188,7 @@
           <w:sz w:val="24"/>
           <w:szCs w:val="24"/>
         </w:rPr>
-        <w:t xml:space="preserve">Yes, but with limits. You can feed AI tools samples of your existing writing and instruct them to match your tone, sentence structure, and vocabulary preferences. Claude and ChatGPT both allow custom instructions that persist across sessions. In practice, the AI maintains your style for roughly 500 to 800 words before drifting back toward its default patterns. Plan to regenerate longer pieces in sections and edit the seams where the style shifts.</w:t>
+        <w:t xml:space="preserve">Yes, but with limits. You can feed AI tools samples of your existing writing and instruct them to match your tone, sentence structure, and vocabulary preferences. Claude and ChatGPT both allow custom instructions that persist across sessions. In practice, the AI drifts back toward its default patterns as outputs get longer — you'll notice the style slipping in longer pieces. Plan to generate in sections and edit the seams where the voice shifts.</w:t>
       </w:r>
     </w:p>
     <w:p>
@@ -2205,7 +2205,7 @@
           <w:sz w:val="28"/>
           <w:szCs w:val="28"/>
         </w:rPr>
-        <w:t xml:space="preserve">How do AI humanizer spinner tools affect your content’s plagiarism score?</w:t>
+        <w:t xml:space="preserve">How do AI humanizer spinner tools affect your content's plagiarism score?</w:t>
       </w:r>
     </w:p>
     <w:p>
@@ -2250,7 +2250,7 @@
           <w:sz w:val="24"/>
           <w:szCs w:val="24"/>
         </w:rPr>
-        <w:t xml:space="preserve">No single edit protects against future updates, but properly humanized content carries lower risk than raw AI output. Google’s algorithm updates increasingly reward depth, originality, and demonstrated expertise — exactly the signals that genuine humanization adds. Sites publishing mass unedited AI content saw the largest traffic drops in Google’s March 2024 and subsequent core updates. Content built on real experience and proper editing weathered those updates with minimal impact.</w:t>
+        <w:t xml:space="preserve">No single edit protects against future updates, but properly humanized content carries lower risk than raw AI output. Google's algorithm updates increasingly reward depth, originality, and demonstrated expertise — exactly the signals that genuine humanization adds. Sites publishing mass unedited AI content saw the largest traffic drops in Google's March 2024 and subsequent core updates. Content built on real experience and proper editing weathered those updates with minimal impact.</w:t>
       </w:r>
     </w:p>
     <w:p>
@@ -2281,7 +2281,7 @@
           <w:sz w:val="24"/>
           <w:szCs w:val="24"/>
         </w:rPr>
-        <w:t xml:space="preserve">Google doesn’t require AI disclosure for standard content. However, transparency builds reader trust, particularly in YMYL niches like health, finance, and legal topics where accuracy expectations are highest. A simple note like "researched and drafted with AI assistance, edited and verified by [your name]" adds a trust signal without undermining your authority. Several major publications including CNET and Bankrate now include AI disclosure labels as standard practice.</w:t>
+        <w:t xml:space="preserve">Google doesn't require AI disclosure for standard content. However, transparency builds reader trust, particularly in YMYL niches like health, finance, and legal topics where accuracy expectations are highest. A simple note like "researched and drafted with AI assistance, edited and verified by [your name]" adds a trust signal without undermining your authority. Several major publications including CNET and Bankrate now include AI disclosure labels as standard practice.</w:t>
       </w:r>
     </w:p>
     <w:p>
@@ -2343,7 +2343,7 @@
           <w:sz w:val="24"/>
           <w:szCs w:val="24"/>
         </w:rPr>
-        <w:t xml:space="preserve">Expert readers in specialised niches spot AI content faster than general audiences. A study by the Journal of Advances in Information Technology (January 2026) found that domain experts identified AI-generated text in their field with 78% accuracy, compared to 52% for non-experts reading the same content. The gap comes from recognising missing nuance — AI writes accurate surface-level information but misses the insider details, common mistakes, and practical caveats that practitioners know from experience.</w:t>
+        <w:t xml:space="preserve">Expert readers in specialised niches spot AI content faster than general audiences. Practitioners recognise missing nuance that casual readers overlook — AI writes accurate surface-level information but misses the insider details, common mistakes, and practical caveats that come from hands-on experience. In technical fields like software engineering, cybersecurity, and medical writing, experienced professionals consistently report catching AI content by what it leaves out, not by what it says wrong. The more specialised your audience, the more you need genuine expertise baked into every section.</w:t>
       </w:r>
     </w:p>
     <w:sectPr>

</xml_diff>

<commit_message>
Second audit pass: add missing citation links, remove AI wording
- Add NP Digital study link for 5.44x traffic and 41% session claims (line 45)
- Add Digital Harvest case study link (line 165)
- Add Digital Applied 16-month study link for 4% gap claim (line 167)
- Remove "landscape" from own prose (line 189) — word we tell readers to kill
- Remove "The practical takeaway:" AI transition formula (line 217)
- Rebuild Word doc with all fixes (12 clickable hyperlinks, up from 10)

Co-Authored-By: Claude Opus 4.6 <noreply@anthropic.com>
Claude-Session: https://claude.ai/code/session_012jX8bmSNRmEaK3kdhxwfZr
</commit_message>
<xml_diff>
--- a/blog-content/How-to-Humanize-AI-Content.docx
+++ b/blog-content/How-to-Humanize-AI-Content.docx
@@ -88,7 +88,7 @@
         </w:rPr>
         <w:t xml:space="preserve">After editing over 60 AI-drafted articles for </w:t>
       </w:r>
-      <w:hyperlink w:history="1" r:id="rIdao3jd3xik6c2axhz3dtz-">
+      <w:hyperlink w:history="1" r:id="rIdobwkvo7zu1byjc8o7mpxs">
         <w:r>
           <w:rPr>
             <w:rStyle w:val="Hyperlink"/>
@@ -185,7 +185,7 @@
         </w:rPr>
         <w:t xml:space="preserve">A </w:t>
       </w:r>
-      <w:hyperlink w:history="1" r:id="rId3hm0zit0hp-gxvca8sc1s">
+      <w:hyperlink w:history="1" r:id="rIdd3apo9abbpjuzrg13tscw">
         <w:r>
           <w:rPr>
             <w:rStyle w:val="Hyperlink"/>
@@ -264,7 +264,29 @@
           <w:sz w:val="24"/>
           <w:szCs w:val="24"/>
         </w:rPr>
-        <w:t xml:space="preserve">Beyond the maths, readers sense something off before they can name it. They feel the absence of opinion, the lack of a real person behind the words. A 2025 content performance study found human-written articles generate 5.44 times more organic traffic and hold reader attention 41% longer than raw AI output — not because the information was better, but because it felt like somebody actually wrote it.</w:t>
+        <w:t xml:space="preserve">Beyond the maths, readers sense something off before they can name it. They feel the absence of opinion, the lack of a real person behind the words. An </w:t>
+      </w:r>
+      <w:hyperlink w:history="1" r:id="rId2jb61urck62mz0tsailqs">
+        <w:r>
+          <w:rPr>
+            <w:rStyle w:val="Hyperlink"/>
+            <w:rFonts w:ascii="Calibri" w:cs="Calibri" w:eastAsia="Calibri" w:hAnsi="Calibri"/>
+            <w:color w:val="0563C1"/>
+            <w:sz w:val="24"/>
+            <w:szCs w:val="24"/>
+            <w:u w:val="single"/>
+          </w:rPr>
+          <w:t xml:space="preserve">NP Digital study of 744 articles across 68 sites</w:t>
+        </w:r>
+      </w:hyperlink>
+      <w:r>
+        <w:rPr>
+          <w:rFonts w:ascii="Calibri" w:cs="Calibri" w:eastAsia="Calibri" w:hAnsi="Calibri"/>
+          <w:color w:val="333333"/>
+          <w:sz w:val="24"/>
+          <w:szCs w:val="24"/>
+        </w:rPr>
+        <w:t xml:space="preserve"> found human-written content generates 5.44 times more organic traffic and holds reader attention 41% longer than raw AI output — not because the information was better, but because it felt like somebody actually wrote it.</w:t>
       </w:r>
     </w:p>
     <w:p>
@@ -386,7 +408,7 @@
         </w:rPr>
         <w:t xml:space="preserve">Here is the exact 8-step editing workflow I use for every AI-drafted article on this site. The whole process takes 60 to 90 minutes per piece — a fraction of the </w:t>
       </w:r>
-      <w:hyperlink w:history="1" r:id="rIdgxuhne_nc5qgca0etnk-0">
+      <w:hyperlink w:history="1" r:id="rIdzi2xucfia1fhlclxuzf-x">
         <w:r>
           <w:rPr>
             <w:rStyle w:val="Hyperlink"/>
@@ -453,7 +475,7 @@
         </w:rPr>
         <w:t xml:space="preserve">A prompt like "write a blog post about email marketing" produces generic fluff. A prompt like "write a 2,000-word guide on re-engagement email sequences for SaaS companies with 30-day trial models, written in first person, referencing a churn rate we reduced from 8.2% to 5.1%" produces something worth editing. I break down this process fully in my </w:t>
       </w:r>
-      <w:hyperlink w:history="1" r:id="rIddtd4_5jcoengkflcqmh4v">
+      <w:hyperlink w:history="1" r:id="rIdauo-yoba-qkcozi6qokqn">
         <w:r>
           <w:rPr>
             <w:rStyle w:val="Hyperlink"/>
@@ -835,7 +857,7 @@
         </w:rPr>
         <w:t xml:space="preserve">I've caught AI fabricating entire studies — complete with plausible-sounding journal names and publication years. If you can't find the original source within two minutes of searching, delete the claim. A wrong citation damages your credibility more than a missing one. This is where I've seen the most damage in </w:t>
       </w:r>
-      <w:hyperlink w:history="1" r:id="rIdedj_2ptlixe2nvcyqvwui">
+      <w:hyperlink w:history="1" r:id="rIduf9hh_m4ah-nkl-p5jaae">
         <w:r>
           <w:rPr>
             <w:rStyle w:val="Hyperlink"/>
@@ -1060,7 +1082,7 @@
         </w:rPr>
         <w:t xml:space="preserve">Google's </w:t>
       </w:r>
-      <w:hyperlink w:history="1" r:id="rIdw1_no_ccykn6lwfa63hyf">
+      <w:hyperlink w:history="1" r:id="rIdkvnzdu7f1tzlext-m5f0i">
         <w:r>
           <w:rPr>
             <w:rStyle w:val="Hyperlink"/>
@@ -1265,7 +1287,7 @@
         </w:rPr>
         <w:t xml:space="preserve">A </w:t>
       </w:r>
-      <w:hyperlink w:history="1" r:id="rIddbsfvg09iepg-4xsgfpzq">
+      <w:hyperlink w:history="1" r:id="rIdpyvzx0dkue43m09q0qbfe">
         <w:r>
           <w:rPr>
             <w:rStyle w:val="Hyperlink"/>
@@ -1313,21 +1335,65 @@
           <w:sz w:val="24"/>
           <w:szCs w:val="24"/>
         </w:rPr>
-        <w:t xml:space="preserve">The clearest proof comes from Digital Harvest's 2025 results: they published 200+ AI-assisted posts, each reviewed and edited by journalists before going live. The result was 144% total traffic growth and 159% organic search growth year over year. SE Ranking reported similar results — their edited AI articles earned 555,000+ impressions and 2,300+ clicks with several top-10 rankings.</w:t>
-      </w:r>
-    </w:p>
-    <w:p>
-      <w:pPr>
-        <w:spacing w:after="200" w:line="276"/>
-      </w:pPr>
-      <w:r>
-        <w:rPr>
-          <w:rFonts w:ascii="Calibri" w:cs="Calibri" w:eastAsia="Calibri" w:hAnsi="Calibri"/>
-          <w:color w:val="333333"/>
-          <w:sz w:val="24"/>
-          <w:szCs w:val="24"/>
-        </w:rPr>
-        <w:t xml:space="preserve">A 16-month tracking study found that AI-assisted content with substantive human editing performed within just 4% of fully human-written content. The editing is the difference between content that ranks and content that sits on page four.</w:t>
+        <w:t xml:space="preserve">The clearest proof comes from </w:t>
+      </w:r>
+      <w:hyperlink w:history="1" r:id="rIdpec0rgspoy2bvemo5ntzr">
+        <w:r>
+          <w:rPr>
+            <w:rStyle w:val="Hyperlink"/>
+            <w:rFonts w:ascii="Calibri" w:cs="Calibri" w:eastAsia="Calibri" w:hAnsi="Calibri"/>
+            <w:color w:val="0563C1"/>
+            <w:sz w:val="24"/>
+            <w:szCs w:val="24"/>
+            <w:u w:val="single"/>
+          </w:rPr>
+          <w:t xml:space="preserve">Digital Harvest's 2025 case study</w:t>
+        </w:r>
+      </w:hyperlink>
+      <w:r>
+        <w:rPr>
+          <w:rFonts w:ascii="Calibri" w:cs="Calibri" w:eastAsia="Calibri" w:hAnsi="Calibri"/>
+          <w:color w:val="333333"/>
+          <w:sz w:val="24"/>
+          <w:szCs w:val="24"/>
+        </w:rPr>
+        <w:t xml:space="preserve">: they published 200+ AI-assisted posts, each reviewed and edited by journalists before going live. The result was 144% total traffic growth and 159% organic search growth year over year. SE Ranking reported similar results — their edited AI articles earned 555,000+ impressions and 2,300+ clicks with several top-10 rankings.</w:t>
+      </w:r>
+    </w:p>
+    <w:p>
+      <w:pPr>
+        <w:spacing w:after="200" w:line="276"/>
+      </w:pPr>
+      <w:r>
+        <w:rPr>
+          <w:rFonts w:ascii="Calibri" w:cs="Calibri" w:eastAsia="Calibri" w:hAnsi="Calibri"/>
+          <w:color w:val="333333"/>
+          <w:sz w:val="24"/>
+          <w:szCs w:val="24"/>
+        </w:rPr>
+        <w:t xml:space="preserve">A </w:t>
+      </w:r>
+      <w:hyperlink w:history="1" r:id="rIdig7q4ps0to2yho2iuzau4">
+        <w:r>
+          <w:rPr>
+            <w:rStyle w:val="Hyperlink"/>
+            <w:rFonts w:ascii="Calibri" w:cs="Calibri" w:eastAsia="Calibri" w:hAnsi="Calibri"/>
+            <w:color w:val="0563C1"/>
+            <w:sz w:val="24"/>
+            <w:szCs w:val="24"/>
+            <w:u w:val="single"/>
+          </w:rPr>
+          <w:t xml:space="preserve">Digital Applied study tracking 4,200 articles over 16 months</w:t>
+        </w:r>
+      </w:hyperlink>
+      <w:r>
+        <w:rPr>
+          <w:rFonts w:ascii="Calibri" w:cs="Calibri" w:eastAsia="Calibri" w:hAnsi="Calibri"/>
+          <w:color w:val="333333"/>
+          <w:sz w:val="24"/>
+          <w:szCs w:val="24"/>
+        </w:rPr>
+        <w:t xml:space="preserve"> found that AI-assisted content with substantive human editing performed within just 4% of fully human-written content. The editing is the difference between content that ranks and content that sits on page four.</w:t>
       </w:r>
     </w:p>
     <w:p>
@@ -1846,9 +1912,9 @@
           <w:sz w:val="24"/>
           <w:szCs w:val="24"/>
         </w:rPr>
-        <w:t xml:space="preserve">The humanised AI approach gives you roughly 80% of pure-human quality at 20% of the cost and 30% of the time. That trade-off is why hybrid content strategies dominate the </w:t>
-      </w:r>
-      <w:hyperlink w:history="1" r:id="rIdzdgv8mcxjsfkaspveek10">
+        <w:t xml:space="preserve">The humanised AI approach gives you roughly 80% of pure-human quality at 20% of the cost and 30% of the time. That trade-off is why the AI-plus-editor model has become the default among teams using the </w:t>
+      </w:r>
+      <w:hyperlink w:history="1" r:id="rIdwcbkzi0097xwsaw_vazn1">
         <w:r>
           <w:rPr>
             <w:rStyle w:val="Hyperlink"/>
@@ -1868,7 +1934,7 @@
           <w:sz w:val="24"/>
           <w:szCs w:val="24"/>
         </w:rPr>
-        <w:t xml:space="preserve"> landscape in 2026.</w:t>
+        <w:t xml:space="preserve"> in 2026.</w:t>
       </w:r>
     </w:p>
     <w:p>
@@ -2092,7 +2158,7 @@
         </w:rPr>
         <w:t xml:space="preserve">The </w:t>
       </w:r>
-      <w:hyperlink w:history="1" r:id="rIdd_cueoobx7qxklh3lf1tw">
+      <w:hyperlink w:history="1" r:id="rIdf60sk8pxpcbg-9lbsj2kj">
         <w:r>
           <w:rPr>
             <w:rStyle w:val="Hyperlink"/>
@@ -2140,7 +2206,7 @@
           <w:sz w:val="24"/>
           <w:szCs w:val="24"/>
         </w:rPr>
-        <w:t xml:space="preserve">The practical takeaway: if you use AI as a drafting tool and add genuine human expertise through editing, Google treats your content the same as any other content. The moment you skip the editing and publish AI output at scale, you're playing a short-term game that Google has explicitly said they're watching for.</w:t>
+        <w:t xml:space="preserve">If you use AI as a drafting tool and add genuine human expertise through editing, Google treats your content the same as any other content. The moment you skip the editing and publish AI output at scale, you're playing a short-term game that Google has explicitly said they're watching for.</w:t>
       </w:r>
     </w:p>
     <w:p>

</xml_diff>